<commit_message>
Revise Book 2 manuscript: verbatim Book 1 epigraphs, ch1-4 editorial pass, ch3 compression, canon fixes
- Add verbatim, attributed Book 1 epigraphs to all 16 chapters; remove paraphrased cross-cut interludes
- Ch1: evidence-based blood-test scene, gana block collapse, dialogue lift, hook timing, voice cleanup
- Ch2: recovery-station dialogue, Ravi ending rework, ration-thread link, spec-dump trim
- Ch3: compress backstory in place (6,028 -> 4,841 words), cut announced-theme vow paragraph, Teresa scenes untouched
- Ch4: fix exit to match Book 1 canon (Gage carrying Otto, dragging Ben), replace SWAT with Infinity Guard, move sabotage reveal to Elara's discovery
- Canon: Gage height six-foot-five everywhere (fix ch5)
- Add feedback-and-future-items.md tracker
</commit_message>
<xml_diff>
--- a/manuscript/chapter-01-assigned-to-witness.docx
+++ b/manuscript/chapter-01-assigned-to-witness.docx
@@ -12,6 +12,20 @@
     </w:p>
     <w:p>
       <w:r>
+        <w:rPr>
+          <w:i/>
+          <w:color w:val="5C6B7D"/>
+        </w:rPr>
+        <w:t>Three days. In the brutal calculus of Miner Town, three days was the precise duration required to wither the human spirit and begin the biological harvest. Every child feared it from the moment they understood the weight of the mountain — a dark transition called the Initiation.</w:t>
+      </w:r>
+    </w:p>
+    <w:p>
+      <w:r>
+        <w:t>— Book 1, Chapter 3: The Initiation</w:t>
+      </w:r>
+    </w:p>
+    <w:p>
+      <w:r>
         <w:t>## Day Zero: Assignment</w:t>
       </w:r>
     </w:p>
@@ -22,7 +36,7 @@
     </w:p>
     <w:p>
       <w:r>
-        <w:t>At the Institute, this would have been the hour she went to sleep, full of caffeine and unfinished arguments. Trinity had cured her of that. Her schedule controlled when she woke, went about her daily routine, and slept.</w:t>
+        <w:t>At the Institute, this would have been the hour she went to sleep, full of caffeine and unfinished arguments. Trinity had cured her of that.</w:t>
       </w:r>
     </w:p>
     <w:p>
@@ -32,42 +46,22 @@
     </w:p>
     <w:p>
       <w:r>
-        <w:t>Drona governed knowledge, research, innovation, and science. Chanakya governed policy, diplomacy, and political strategy. Ashoka governed protection, enforcement, and sanctioned force. Kubera governed resources, logistics, and allocation.</w:t>
+        <w:t>Elara came from Drona. That was both who she was and what she was for.</w:t>
       </w:r>
     </w:p>
     <w:p>
       <w:r>
-        <w:t>The official histories called them ancient communities. They were not clans or castes. They were institutions built to keep civilization alive. Trinity had turned that responsibility into ownership. The ganas fought through budgets, appointments, restricted data, and carefully arranged accidents. Each claimed to serve the whole system. Each believed the others were too dangerous to control it.</w:t>
+        <w:t>She sat on the edge of her bed with the thought that returned every morning: Trinity trained its people to mistake pain for honesty. The workers who complained least were admired; the ones who endured longest were rewarded. Holding that thought had kept her from becoming complacent. It had also kept her from rising higher.</w:t>
       </w:r>
     </w:p>
     <w:p>
       <w:r>
-        <w:t>Elara came from Drona, and in Trinity that was both identity and instruction. Her path had always been obvious: protect knowledge, improve systems, eliminate waste.</w:t>
+        <w:t>She moved through the routine her body knew by heart: wash, dry, button, seal, align. Nutrient tonic measured to the milliliter. The city measured everything except the cost of the things it demanded.</w:t>
       </w:r>
     </w:p>
     <w:p>
       <w:r>
-        <w:t>She sat on the edge of her bed before beginning the next chore. The same thought returned every morning. It had kept her from becoming complacent, but it had also kept her from rising higher in Trinity.</w:t>
-      </w:r>
-    </w:p>
-    <w:p>
-      <w:r>
-        <w:t>Trinity had trained its people to mistake pain for honesty. The workers who complained least were admired. The ones who endured the longest were rewarded. Even comfort was spoken of carefully, as if pleasure itself were a vice and joy a thing to be hidden. Grief could be named, but tenderness was rarely allowed to stand in public without suspicion.</w:t>
-      </w:r>
-    </w:p>
-    <w:p>
-      <w:r>
-        <w:t>She rose and moved through the routine her body knew by heart: wash, dry, button, seal, align. Warm water at fixed pressure. Uniform fibers tightening to regulation fit. Nutrient tonic measured to the milliliter. The city measured everything except the cost of the things it demanded.</w:t>
-      </w:r>
-    </w:p>
-    <w:p>
-      <w:r>
-        <w:t>Before leaving her room, Elara felt the familiar stab of guilt. It came in cycles, especially among people in her position. Today she was being inducted into the Initiation Monitoring team.</w:t>
-      </w:r>
-    </w:p>
-    <w:p>
-      <w:r>
-        <w:t>Everyone in Trinity understood what the Initiation meant: false hope, engineered fear, pain, suffering, and sometimes blood. Alongside the guilt came anticipation, sometimes even excitement. Children entering the Initiation still believed something might change for them. The monitors wondered what they would witness and whether they could control it when the system went off-script.</w:t>
+        <w:t>Today she was being inducted into the Initiation Monitoring team. Everyone in Trinity understood what the Initiation meant: false hope, engineered fear, pain, and sometimes blood. The familiar stab of guilt arrived on schedule, and with it something she was less willing to name — anticipation.</w:t>
       </w:r>
     </w:p>
     <w:p>
@@ -87,7 +81,7 @@
     </w:p>
     <w:p>
       <w:r>
-        <w:t>Elara pressed her palm to the scanner. The lock flashed green, and the seal released with a low acknowledgment tone. Behind her, the room sealed into stillness. Ahead, corridor lights unfurled in sequence, guiding her toward the control wing where the Initiation monitors were gathering.</w:t>
+        <w:t>The lock flashed green, and the seal released with a low acknowledgment tone. Behind her, the room sealed into stillness. Ahead, corridor lights unfurled in sequence, guiding her toward the control wing where the Initiation monitors were gathering.</w:t>
       </w:r>
     </w:p>
     <w:p>
@@ -102,7 +96,7 @@
     </w:p>
     <w:p>
       <w:r>
-        <w:t>Elara pressed her wrist to the plate. The panel lit, and, in a clipped administrative voice, it said, "Monitoring assignment confirmed. Initiation Observation Tier-2. Mandatory pre-shift blood validation. Security verification required."</w:t>
+        <w:t>Elara pressed her wrist to the plate. The panel lit, and, in a clipped administrative voice, it said, "Monitoring assignment confirmed. Initiation Observation Tier-2. Mandatory pre-shift blood validation."</w:t>
       </w:r>
     </w:p>
     <w:p>
@@ -112,57 +106,47 @@
     </w:p>
     <w:p>
       <w:r>
-        <w:t>In older histories, the sample would have been tested for signs of illness. Trinity still captured those values. It simply cared about different results first. The live display filled with stress response, emotional volatility, impulse control, and compliance markers.</w:t>
+        <w:t>In older histories, the sample would have been tested for signs of illness. Trinity still captured those values. It simply cared about different results first.</w:t>
       </w:r>
     </w:p>
     <w:p>
       <w:r>
-        <w:t>A thin amber line flickered beside one metric, then settled green. Not Are you healthy? Not Are you at risk? The real question was colder: Are you chemically aligned to observe suffering without destabilizing protocol?</w:t>
+        <w:t>The reader returned an estimated cortisol level above her thirty-day median. The plate's pulse trace showed heart-rate variability below her baseline. Glucose and C-reactive protein sat within her usual range. Elara read them as measures of a body under strain, not explanations for why. The hour, her anticipation, even the puncture could shift a reading. The machine had helped create the conditions it was now measuring.</w:t>
       </w:r>
     </w:p>
     <w:p>
       <w:r>
-        <w:t>"Behavioral stability: within range," the panel said. "Empathy surge risk: low. Corrective intervention impulse: suppressed. Clearance granted." A green band lit across her wrist for three seconds and faded.</w:t>
+        <w:t>A thin amber line flickered beside cortisol, then settled green. Not Are you healthy? Not Are you at risk? The real question was colder: Are you chemically aligned to observe suffering without destabilizing protocol?</w:t>
       </w:r>
     </w:p>
     <w:p>
       <w:r>
-        <w:t>It was a small ceremony, almost elegant in its cruelty.</w:t>
+        <w:t>Then a second panel resolved beneath the first, in different type, with no units and no range.</w:t>
       </w:r>
     </w:p>
     <w:p>
       <w:r>
-        <w:t>Elara walked toward the Skylark elevators. The pods moved bodies between tiers and repeated a lesson every citizen was expected to remember: be grateful.</w:t>
+        <w:t>"Behavioral stability: within range," it said. "Empathy surge risk: low. Corrective intervention impulse: suppressed. Clearance granted." A green band lit across her wrist for three seconds and faded.</w:t>
       </w:r>
     </w:p>
     <w:p>
       <w:r>
-        <w:t>Grateful for controlled air, measured light, sterile water, and predictable days. Grateful despite the ugliness beneath the system and the pain it kept out of sight.</w:t>
+        <w:t>Elara walked toward the Skylark elevators, past the lesson every citizen was expected to remember: be grateful. Grateful for controlled air, measured light, sterile water, and predictable days.</w:t>
       </w:r>
     </w:p>
     <w:p>
       <w:r>
-        <w:t>They called the elevators Skylarks after old-world songbirds associated with ascent and dawn. Trinity liked the name because it made separation sound like freedom.</w:t>
+        <w:t>They called the elevators Skylarks after old-world songbirds associated with ascent and dawn. The name appeared on every wall in soft blue lettering: RISE ABOVE SUFFERING.</w:t>
       </w:r>
     </w:p>
     <w:p>
       <w:r>
-        <w:t>The name appeared on every wall in soft blue lettering: RISE ABOVE SUFFERING.</w:t>
+        <w:t>From the upper levels, she could avoid hunger, disease, deprivation, pain, and loneliness. Trinity had only moved those things somewhere else.</w:t>
       </w:r>
     </w:p>
     <w:p>
       <w:r>
-        <w:t>From the upper levels, she could avoid hunger, disease, deprivation, pain, and loneliness. Trinity had not defeated those things. It had moved them somewhere else.</w:t>
-      </w:r>
-    </w:p>
-    <w:p>
-      <w:r>
-        <w:t>The elevator took thirty seconds to lift her toward the monitoring towers. The towers were built for separation. Several thousand feet above Trinity's lower levels, they kept the miners below out of sight.</w:t>
-      </w:r>
-    </w:p>
-    <w:p>
-      <w:r>
-        <w:t>At that altitude, cloud cover and atmospheric barriers erased detail. Identification became mandatory through locators and tags, where people appeared first as serial numbers and only incidentally as bodies. As the pod rose, Elara watched the city fall into layers beneath her. In Trinity, altitude measured distance from other people's pain. By the time the Skylark opened at the control tier, the lesson was complete. Ascent was not freedom. It was distance with a better view.</w:t>
+        <w:t>The elevator took thirty seconds to lift her toward the monitoring towers, several thousand feet above the levels that kept the miners out of sight. Cloud cover and atmospheric barriers erased detail at that altitude, and people appeared first as serial numbers and only incidentally as bodies. As the pod rose, Elara watched the city fall into layers beneath her. In Trinity, altitude measured distance from other people's pain.</w:t>
       </w:r>
     </w:p>
     <w:p>
@@ -182,7 +166,7 @@
     </w:p>
     <w:p>
       <w:r>
-        <w:t>Ravi came first, Chanakya's representative to the monitoring team. His face held a calm that people trusted until they realized they had been studied, not seen. He nodded once at Elara. It was courtesy, but it was also a warning: this was not a meeting between equals. It was an arrangement of control.</w:t>
+        <w:t>Ravi came first, Chanakya's representative to the monitoring team. His face held a calm that people trusted until they realized they had been studied, not seen. He nodded once at Elara. It was courtesy, and it was a warning: the room was an arrangement of control, not a meeting between equals.</w:t>
       </w:r>
     </w:p>
     <w:p>
@@ -197,22 +181,12 @@
     </w:p>
     <w:p>
       <w:r>
-        <w:t>Ashoka's representative did not hurry. He did not need to. He crossed the floor broad-shouldered and expressionless, a scar tracing one side of his jaw.</w:t>
+        <w:t>Ashoka's representative did not hurry. He crossed the floor broad-shouldered and expressionless, a scar tracing one side of his jaw. No Chanakya polish, no Kubera theater — just force held in reserve, disciplined into stillness.</w:t>
       </w:r>
     </w:p>
     <w:p>
       <w:r>
-        <w:t>There was nothing performative about him. No Chanakya polish. No Kubera theater. Just force held in reserve, disciplined into stillness.</w:t>
-      </w:r>
-    </w:p>
-    <w:p>
-      <w:r>
-        <w:t>Elara looked from one representative to the next. Four ganas. Four claims to the right kind of control.</w:t>
-      </w:r>
-    </w:p>
-    <w:p>
-      <w:r>
-        <w:t>The room felt dangerous.</w:t>
+        <w:t>Elara looked from one representative to the next. Four ganas, four claims to the right kind of control. They fought each other through budgets, appointments, and quietly arranged accidents, each certain the other three were too dangerous to hold the whole thing alone.</w:t>
       </w:r>
     </w:p>
     <w:p>
@@ -232,17 +206,17 @@
     </w:p>
     <w:p>
       <w:r>
-        <w:t>Elara took VARIANCE, the Drona station, because Drona's first obligation was to follow knowledge wherever it led, especially when the data exposed a flaw the system preferred not to name. Her panels lit with pattern drift, stress spikes, deviation corridors, and probability envelopes. Her job was to notice when the system's story and the data's behavior stopped agreeing.</w:t>
+        <w:t>Elara took VARIANCE, the Drona station, because Drona's first obligation was to follow knowledge wherever it led, especially when the data exposed a flaw the system preferred not to name. Her job was to notice when the system's story and the data's behavior stopped agreeing.</w:t>
       </w:r>
     </w:p>
     <w:p>
       <w:r>
-        <w:t>Daren lowered himself into THRESHOLD, the Kubera station, where allocation became a question of what could be spent, withheld, or sacrificed without endangering the whole. Intervention bands, cost triggers, acceptable-loss curves, resource release windows. He did not watch people first. He watched limits.</w:t>
+        <w:t>Daren lowered himself into THRESHOLD, the Kubera station, where allocation became a question of what could be spent, withheld, or sacrificed without endangering the whole. He did not watch people first. He watched limits.</w:t>
       </w:r>
     </w:p>
     <w:p>
       <w:r>
-        <w:t>Rohan remained standing for a beat before stepping into CORRECTION. The Ashoka console came alive beneath his hand with force ladders, containment protocols, and escalation pathways. In Trinity's security framework, the force ladder was Ashoka's standardized escalation scale for physical intervention and coercion—a rigid progression ranging from passive atmospheric pressure to direct warden suppression.</w:t>
+        <w:t>Rohan remained standing for a beat before stepping into CORRECTION. The Ashoka console came alive beneath his hand with force ladders, containment protocols, and escalation pathways — the force ladder being Ashoka's standardized escalation scale, a rigid progression from passive atmospheric pressure to direct warden suppression.</w:t>
       </w:r>
     </w:p>
     <w:p>
@@ -252,12 +226,12 @@
     </w:p>
     <w:p>
       <w:r>
-        <w:t>The Initiation queue populated on screen—sixteen names materialized like component numbers in a system ledger, stripped of color or ceremony, rendered as mere data points in Trinity's inventory. Sixteen children. Four monitors. Four ganas. On paper, the mathematics promised a clean division. Predictable.</w:t>
+        <w:t>The Initiation queue populated on screen—sixteen names materialized like component numbers in a system ledger, stripped of color or ceremony. Sixteen children. Four monitors. Four ganas. On paper, the mathematics promised a clean division.</w:t>
       </w:r>
     </w:p>
     <w:p>
       <w:r>
-        <w:t>Elara leaned toward the screen as the system began its assignment sequence. Thirteen names streamed toward the EVENT, THRESHOLD, CORRECTION, and VARIANCE consoles, each connected to its designated gana with the mechanical precision Trinity preferred. At first, the grid moved through the queue with invisible efficiency.</w:t>
+        <w:t>Elara leaned toward the screen as the system began its assignment sequence. Thirteen names streamed toward the EVENT, THRESHOLD, CORRECTION, and VARIANCE consoles, each connected to its designated gana with the mechanical precision Trinity preferred.</w:t>
       </w:r>
     </w:p>
     <w:p>
@@ -287,31 +261,47 @@
     </w:p>
     <w:p>
       <w:r>
-        <w:rPr>
-          <w:i/>
-          <w:color w:val="5C6B7D"/>
-        </w:rPr>
-        <w:t>Below the tower, in another part of the same moment, the iron gates opened with a soul-jarring screech. Gage stood in the dust-choked queue with Otto and Ben, feeling the weight of the moment pressing into his shoulders. They were not anomalies there. They were three boys trying to survive the first step into the dark.</w:t>
-      </w:r>
-    </w:p>
-    <w:p>
-      <w:r>
         <w:t>A red alert bar materialized beneath the three names. OPERATOR INTERVENTION REQUIRED. The system's guardrails had triggered. Whatever metric or pattern these three children violated, whatever gap in Trinity's control framework they represented, the machine could not proceed without human authorization.</w:t>
       </w:r>
     </w:p>
     <w:p>
       <w:r>
-        <w:t>This was probably the first time Trinity's surveillance system had encountered an anomaly of this kind. The four gana representatives searched the online archives and the printed manuals beside their consoles, but neither offered a reason for the designation or an instruction for what came next.</w:t>
+        <w:t>"Archive," Ravi said. "Precedent search. Designation: unassigned."</w:t>
       </w:r>
     </w:p>
     <w:p>
       <w:r>
-        <w:t>Their attention settled on the High Command call button. Ravi lifted his hand toward it, ready to request assistance, but Elara caught his wrist.</w:t>
+        <w:t>"No records returned," the console answered.</w:t>
       </w:r>
     </w:p>
     <w:p>
       <w:r>
-        <w:t>"Wait," she said. "It's our first day. We cannot give them a reason to think we need supervision before we have even begun. Let's see if we can solve it ourselves."</w:t>
+        <w:t>Daren was already paging through the printed manual beside THRESHOLD. "The routing appendix has no fifth designation. It has no procedure for the absence of one, either."</w:t>
+      </w:r>
+    </w:p>
+    <w:p>
+      <w:r>
+        <w:t>"Then the system has never done this before," Rohan said.</w:t>
+      </w:r>
+    </w:p>
+    <w:p>
+      <w:r>
+        <w:t>Their attention settled on the High Command call button. Ravi lifted his hand toward it, and Elara caught his wrist.</w:t>
+      </w:r>
+    </w:p>
+    <w:p>
+      <w:r>
+        <w:t>"Wait. It's our first day. We cannot give them a reason to think we need supervision before we have even begun. Let's see if we can solve it ourselves."</w:t>
+      </w:r>
+    </w:p>
+    <w:p>
+      <w:r>
+        <w:t>Ravi looked at her hand until she withdrew it. "You are asking us to sit on an unclassified anomaly."</w:t>
+      </w:r>
+    </w:p>
+    <w:p>
+      <w:r>
+        <w:t>"I am asking us to classify it first."</w:t>
       </w:r>
     </w:p>
     <w:p>
@@ -321,137 +311,142 @@
     </w:p>
     <w:p>
       <w:r>
-        <w:t>Daren moved first with the efficient certainty of someone who believed problems were problems and people were data points to organize. He spoke their names loudly, his voice carrying that particular disdain his gana was known for.</w:t>
+        <w:t>Daren moved first, with the efficient certainty of someone who believed problems were problems and people were data points to organize. He read the three names off the grid the way an auditor reads a shipment.</w:t>
       </w:r>
     </w:p>
     <w:p>
       <w:r>
-        <w:t>"Well, looks like we have some unassigned losers here," he said. "Gage, Otto, and Ben. Let's just say all their last names are don't matter."</w:t>
+        <w:t>"Gage. Otto. Ben. No family designations worth indexing. Three rounding errors the system was too honest to hide."</w:t>
       </w:r>
     </w:p>
     <w:p>
       <w:r>
-        <w:t>There was a cruelty in the dismissal that was almost kind. By erasing their identities, Daren made them manageable. They became exceptions to sort through, not people to reckon with.</w:t>
+        <w:t>The cruelty was in the precision. He had already reduced them to entries that could be sorted, priced, and closed.</w:t>
       </w:r>
     </w:p>
     <w:p>
       <w:r>
-        <w:t>Elara pulled up the detailed profile of each of the three unassigned Initiation candidates. The screens filled with data—medical scans, behavioral histories, genetic markers, skill assessments. Thousands of points of measurement, each one designed to fit a person into a category. But these three didn't fit. In Trinity, the only way to do the work of Trinity was to stop seeing the work as something done to people. She pulled up their files and began to look for the pattern that would explain why the system had rejected them. It was easier this way. Easier to see them as problems to solve than as people waiting to be sorted into Trinity's preferred categories. Easier, and safer.</w:t>
+        <w:t>Elara pulled up the detailed profile of each of the three unassigned Initiation candidates. The screens filled with data—medical scans, behavioral histories, genetic markers, skill assessments. Thousands of points of measurement, each one designed to fit a person into a category. These three didn't fit. She began to look for the pattern that would explain why the system had rejected them.</w:t>
       </w:r>
     </w:p>
     <w:p>
       <w:r>
-        <w:t>She turned to Rohan. "Can you hold down the fort while we focus on sorting out these exceptions?"</w:t>
+        <w:t>She turned to Rohan. "Keep the primary feeds while we sort the exceptions."</w:t>
       </w:r>
     </w:p>
     <w:p>
       <w:r>
-        <w:t>Rohan heard Elara and simply complied. He had read the debrief that morning and knew she was the lead for their group. There was a hierarchy even here, in this room where the four ganas were supposed to balance each other, and Elara had earned her authority through excellence. He recognized that and moved out of the way without objection.</w:t>
+        <w:t>Rohan held her gaze for a moment, then nodded and turned back to CORRECTION. The morning debrief had named her operational lead, and Ashoka honored a chain of command it had agreed to.</w:t>
       </w:r>
     </w:p>
     <w:p>
       <w:r>
-        <w:t>Elara was enjoying the familiar satisfactions that came from being the best in the room. It was not pride, exactly. It was something closer to relief. In a system built to measure and rank, at least she knew where she stood.</w:t>
+        <w:t>Daren did not look up from THRESHOLD. "Drona chairs the first anomaly of the cycle. Noted."</w:t>
       </w:r>
     </w:p>
     <w:p>
       <w:r>
-        <w:t>Elara pulled up Gage's profile and the data rendered itself on the screen like a description of someone's worth. She started reading aloud, her voice steady and clinical.</w:t>
+        <w:t>An objection, filed as agreement. Elara let it stand. Her lead was real, and it would be billed—in Kubera's accounting, every use of authority entered someone's ledger.</w:t>
       </w:r>
     </w:p>
     <w:p>
       <w:r>
-        <w:t>"Male. Six feet four inches. Two hundred eighty pounds."</w:t>
+        <w:t>Elara pulled up Gage's profile, and the data rendered itself on the screen like a description of someone's worth. She read aloud, her voice steady and clinical.</w:t>
       </w:r>
     </w:p>
     <w:p>
       <w:r>
-        <w:t>She glanced up from the display. The figures hit her before the person did: too large for the ration, too heavy for the work, too impossible for the system to explain in one glance. In Miner Town, where resources were strictly rationed and bodies were built for specific work, a person that size shouldn't exist. Shouldn't be possible.</w:t>
+        <w:t>"Male. Six feet five inches. Two hundred eighty pounds."</w:t>
       </w:r>
     </w:p>
     <w:p>
       <w:r>
-        <w:t>"Wow. I didn't know there were teenagers that big anywhere, let alone in Trinity. How does he get that big on starch cubes alone?"</w:t>
+        <w:t>She read the numbers twice. A Miner Town ration built one kind of body: lean, durable, ground down by seventeen. It did not build this. Someone had spent years putting calories into this boy that the ledger had never issued.</w:t>
       </w:r>
     </w:p>
     <w:p>
       <w:r>
-        <w:t>It was a genuine question—the kind that revealed a gap in her understanding of how the system actually worked. She looked around at the other three monitors, and in that moment of asking, she was no longer simply assigning data points. She was wondering about a person.</w:t>
+        <w:t>"That mass doesn't close against his ration history," she said. "Someone has been feeding him off the books since childhood, and the system never flagged it."</w:t>
       </w:r>
     </w:p>
     <w:p>
       <w:r>
-        <w:t>"Do you all mind if I assign Gage to me?"</w:t>
+        <w:t>"Then the anomaly has parents," Daren said, without looking up. "File it."</w:t>
       </w:r>
     </w:p>
     <w:p>
       <w:r>
-        <w:t>Everyone nodded. They didn't see the need for excitement or fascination with a lowly miner. But Elara saw it. Or at least some part of her did. She pushed it down, buried it under protocol, and claimed him as hers.</w:t>
+        <w:t>She did not file it. Somewhere between the numbers and the question, Gage had stopped being an entry and become a person someone had gone hungry for.</w:t>
       </w:r>
     </w:p>
     <w:p>
       <w:r>
-        <w:t>She tagged Gage to herself and pulled up Ben's profile. The relief in the data was immediate—normal height, normal weight, normal everything. The kind of person who would fit into Trinity's equations without raising questions.</w:t>
+        <w:t>"Assign Gage to me."</w:t>
       </w:r>
     </w:p>
     <w:p>
       <w:r>
-        <w:t>"Five feet eight inches. One hundred sixty pounds."</w:t>
+        <w:t>No one objected. They saw a lowly miner. Elara saw the outline of a family the ledger had missed, and she buried the thought under protocol as she claimed him.</w:t>
       </w:r>
     </w:p>
     <w:p>
       <w:r>
-        <w:t>She glanced across the room. "Well, now that's more like it. Your average joe. Anyone want to volunteer to cater to this fine gentleman?"</w:t>
+        <w:t>She tagged Gage to herself and pulled up Ben's profile. The relief in the data was immediate—normal height, normal weight, normal everything.</w:t>
       </w:r>
     </w:p>
     <w:p>
       <w:r>
-        <w:t>Ravi's hand moved before he fully understood why. It was instinct, the professional recognition of his domain. He knew better than any of them that the average miner was the true governing force in any system. The majority set the rhythm, absorbed the pressure, and kept the machinery running. That was the Chanakya way: study the many, understand the mainstream, and use that understanding to decide where the system would bend and where it would break. Ben's measurements were ordinary in the most important sense. They were not the exception. They were the baseline. The kind of disciplined, efficient build that kept the deep shafts moving without noise or collapse. That was why Ben interested him. Not because Ben was remarkable, but because Ben was representative.</w:t>
+        <w:t>"Five feet eight. One hundred sixty pounds. Every value inside the reference band."</w:t>
       </w:r>
     </w:p>
     <w:p>
       <w:r>
-        <w:t>Ravi reached forward, his hand closing over the assignment console. "I'll take Ben."</w:t>
+        <w:t>"Which is why he matters," Ravi said. "Exceptions tell you where a system breaks. The baseline tells you how it runs. Sixteen thousand bodies like his keep the shafts open."</w:t>
       </w:r>
     </w:p>
     <w:p>
       <w:r>
-        <w:t>The gesture was possessive in a way that surprised even him. In claiming Ben, he was claiming something he understood. And in a room where understanding was currency, that felt like power.</w:t>
+        <w:t>"You want the unremarkable one," Daren said.</w:t>
       </w:r>
     </w:p>
     <w:p>
       <w:r>
-        <w:t>Elara pulled up the final profile and leaned back slightly. The moment stretched as the data loaded. She scrolled through Otto's measurements, reading them like a story written in numbers.</w:t>
+        <w:t>"I want the representative one." Ravi's hand closed over the assignment console. "I'll take Ben."</w:t>
       </w:r>
     </w:p>
     <w:p>
       <w:r>
-        <w:t>"Height five feet nine. Weight one hundred seventy pounds."</w:t>
+        <w:t>The gesture was possessive in a way that surprised even him. In a room where understanding was currency, claiming what he understood felt like power.</w:t>
       </w:r>
     </w:p>
     <w:p>
       <w:r>
-        <w:t>On the surface, he was no different from Ben. The same build. The kind of frame that Trinity could work with. But then she saw it in the data, the number that broke the pattern.</w:t>
+        <w:t>Elara pulled up the final profile. The moment stretched as the data loaded.</w:t>
       </w:r>
     </w:p>
     <w:p>
       <w:r>
-        <w:t>"On the surface, he's no different from Ben. The Trinity scanner is showing an abnormally high energy signature."</w:t>
+        <w:t>"Height five feet nine. Weight one hundred seventy. Same build as Ben—" She stopped. "The scanner is showing an abnormally high energy signature."</w:t>
       </w:r>
     </w:p>
     <w:p>
       <w:r>
-        <w:t>Before Elara could finish the thought, Rohan was already on his feet, one hand raised from the CORRECTION console.</w:t>
+        <w:t>"Define abnormal," Ravi said.</w:t>
+      </w:r>
+    </w:p>
+    <w:p>
+      <w:r>
+        <w:t>"Off the calibration curve. It isn't reading him like a body. It's reading him like a source."</w:t>
+      </w:r>
+    </w:p>
+    <w:p>
+      <w:r>
+        <w:t>Rohan was already on his feet, one hand raised from the CORRECTION console.</w:t>
       </w:r>
     </w:p>
     <w:p>
       <w:r>
         <w:t>"He is mine to size up."</w:t>
-      </w:r>
-    </w:p>
-    <w:p>
-      <w:r>
-        <w:t>Elara's eyes stayed on the screen. "He wasn't just built differently. The scanner is reading him almost like an energy source."</w:t>
       </w:r>
     </w:p>
     <w:sectPr>

</xml_diff>

<commit_message>
World structure: three Trinitys (Drona/Chanakya/Ashoka) + Meru (Kubera tier) mapped to Miner Town sectors; Ch12/Ch13 maglev scenery rides with Daren's OG dominance beat; Ch16 global warriors of virtue; deep-pass fixes
</commit_message>
<xml_diff>
--- a/manuscript/chapter-01-assigned-to-witness.docx
+++ b/manuscript/chapter-01-assigned-to-witness.docx
@@ -42,6 +42,11 @@
     <w:p>
       <w:r>
         <w:t>Everyone in Trinity had a schedule. The four ganas wrote the schedule for everyone else.</w:t>
+      </w:r>
+    </w:p>
+    <w:p>
+      <w:r>
+        <w:t>Trinity was three cities wearing one name. Trinity-1 was Drona's: institutes, archives, and the monitoring towers. Trinity-2 was Chanakya's, where policy was drafted in rooms above its own manicured districts. Trinity-3 was Ashoka's, reinforced and drilled. Each platform housed its gana and the civilians who lived under its particular weather — clerks, technicians, teachers, families whose ordinary days ran on schedules written above them — and each presided over its matching sector of Miner Town below: three columns of labor holding up three islands of sky. And above them all hung Meru, Kubera's tier, where the gana lived among the only people in the world permitted to be merely rich — higher in every way the ledgers could record. Officially, Meru presided over nothing. It merely managed the resources of all three sectors, and called that service. Elara had never met anyone below Meru who believed the word merely.</w:t>
       </w:r>
     </w:p>
     <w:p>

</xml_diff>

<commit_message>
Ch1: Observation Tier-1 fix + host-platform monitor logic; add title spacing paragraph to all 16 DOCX (user formatting), sync scripts updated
</commit_message>
<xml_diff>
--- a/manuscript/chapter-01-assigned-to-witness.docx
+++ b/manuscript/chapter-01-assigned-to-witness.docx
@@ -10,6 +10,7 @@
         <w:t>Chapter 1: Assigned to Witness</w:t>
       </w:r>
     </w:p>
+    <w:p/>
     <w:p>
       <w:r>
         <w:rPr>
@@ -101,7 +102,7 @@
     </w:p>
     <w:p>
       <w:r>
-        <w:t>Elara pressed her wrist to the plate. The panel lit, and, in a clipped administrative voice, it said, "Monitoring assignment confirmed. Initiation Observation Tier-2. Mandatory pre-shift blood validation."</w:t>
+        <w:t>Elara pressed her wrist to the plate. The panel lit, and, in a clipped administrative voice, it said, "Monitoring assignment confirmed. Initiation Observation Tier-1. Mandatory pre-shift blood validation."</w:t>
       </w:r>
     </w:p>
     <w:p>
@@ -166,7 +167,7 @@
     </w:p>
     <w:p>
       <w:r>
-        <w:t>One figure stepped from each threshold. For a moment, the four of them stood around the Initiation wing, each carrying a different doctrine in the same uniform.</w:t>
+        <w:t>One figure stepped from each threshold. For a moment, the four of them stood around the Initiation wing, each carrying a different doctrine in the same uniform. This cycle's Initiation belonged to Sector 1, so Observation Tier-1 sat in Drona's tower and the other three ganas had sent their monitors to it — guests with full consoles and borrowed quarters, the way Drona's own representatives would travel to Tier-2 or Tier-3 when the cycle belonged to another sector.</w:t>
       </w:r>
     </w:p>
     <w:p>

</xml_diff>

<commit_message>
Bold black chapter titles in all 16 DOCX (user formatting); sync scripts emit the styling
</commit_message>
<xml_diff>
--- a/manuscript/chapter-01-assigned-to-witness.docx
+++ b/manuscript/chapter-01-assigned-to-witness.docx
@@ -7,6 +7,10 @@
         <w:pStyle w:val="Heading1"/>
       </w:pPr>
       <w:r>
+        <w:rPr>
+          <w:b/>
+          <w:color w:val="000000"/>
+        </w:rPr>
         <w:t>Chapter 1: Assigned to Witness</w:t>
       </w:r>
     </w:p>

</xml_diff>

<commit_message>
DOCX styling: epigraph attribution lines italic grey matching excerpts; render ## section headers as bold black subheadings; all 16 scripts + docs
</commit_message>
<xml_diff>
--- a/manuscript/chapter-01-assigned-to-witness.docx
+++ b/manuscript/chapter-01-assigned-to-witness.docx
@@ -26,12 +26,20 @@
     </w:p>
     <w:p>
       <w:r>
+        <w:rPr>
+          <w:i/>
+          <w:color w:val="5C6B7D"/>
+        </w:rPr>
         <w:t>— Book 1, Chapter 3: The Initiation</w:t>
       </w:r>
     </w:p>
     <w:p>
       <w:r>
-        <w:t>## Day Zero: Assignment</w:t>
+        <w:rPr>
+          <w:b/>
+          <w:color w:val="000000"/>
+        </w:rPr>
+        <w:t>Day Zero: Assignment</w:t>
       </w:r>
     </w:p>
     <w:p>

</xml_diff>